<commit_message>
Fill in manuscript declarations and disclose AI-assisted development
Declarations: funding (no specific grant), competing interest (none),
data availability (GitHub, sample models not redistributed), and the
generative AI declaration naming the tool and its use. Placeholders
remain for author names, CRediT roles and the repository URL.

Per Elsevier's GenAI policy, add a paragraph to Section 4.1 describing
AI-assisted software development and data analysis and how the results
were verified independently of the agent.

Co-Authored-By: Claude Opus 5.5 <noreply@anthropic.com>
</commit_message>
<xml_diff>
--- a/paper/manuscript.docx
+++ b/paper/manuscript.docx
@@ -8257,6 +8257,14 @@
     </w:p>
     <w:p>
       <w:pPr>
+        <w:pStyle w:val="BodyText"/>
+      </w:pPr>
+      <w:r>
+        <w:t xml:space="preserve">A generative AI coding agent, Claude Code with the Claude Opus 5.5 model (Anthropic), assisted with software development and data analysis. Under the authors’ direction it wrote the Revit extension, the analysis package, the experiment scripts and the scripts that generate the figures and tables, and it ran the experiments. The architecture diagram (Fig. 1) was rendered from a layout specification written with the same tool. Its output was verified independently of the agent in four ways: the automated test suite described above, agreement with Revit’s own solid-intersection filter (Section 5.1), exact load equilibrium in both models, and identity of incremental and full recomputation in the twin benchmark. Every number, table and plot in this paper is generated by the released scripts from the stored results, so all of them can be reproduced. The agent also searched the literature through the OpenAlex API, and every reference was checked against its DOI record before inclusion.</w:t>
+      </w:r>
+    </w:p>
+    <w:p>
+      <w:pPr>
         <w:pStyle w:val="Heading2"/>
       </w:pPr>
       <w:bookmarkStart w:id="32" w:name="_40c34dafa3a7c64bd55534d8fb8cdaed8344231"/>
@@ -12772,43 +12780,33 @@
         <w:t xml:space="preserve"> </w:t>
       </w:r>
       <w:r>
-        <w:t xml:space="preserve">[To be completed by the authors.]</w:t>
-      </w:r>
-    </w:p>
-    <w:p>
-      <w:pPr>
-        <w:pStyle w:val="BodyText"/>
-      </w:pPr>
-      <w:r>
         <w:rPr>
           <w:b/>
           <w:bCs/>
         </w:rPr>
-        <w:t xml:space="preserve">Declaration of competing interests.</w:t>
-      </w:r>
-      <w:r>
-        <w:t xml:space="preserve"> </w:t>
-      </w:r>
-      <w:r>
-        <w:t xml:space="preserve">The authors declare that they have no known competing financial interests or personal relationships that could have appeared to influence the work reported in this paper. [Authors to confirm.]</w:t>
-      </w:r>
-    </w:p>
-    <w:p>
-      <w:pPr>
-        <w:pStyle w:val="BodyText"/>
-      </w:pPr>
+        <w:t xml:space="preserve">[Author 1]:</w:t>
+      </w:r>
+      <w:r>
+        <w:t xml:space="preserve"> </w:t>
+      </w:r>
+      <w:r>
+        <w:t xml:space="preserve">[roles].</w:t>
+      </w:r>
+      <w:r>
+        <w:t xml:space="preserve"> </w:t>
+      </w:r>
       <w:r>
         <w:rPr>
           <w:b/>
           <w:bCs/>
         </w:rPr>
-        <w:t xml:space="preserve">Data availability.</w:t>
-      </w:r>
-      <w:r>
-        <w:t xml:space="preserve"> </w:t>
-      </w:r>
-      <w:r>
-        <w:t xml:space="preserve">The code, experiment scripts, result tables and the expert rating instrument are available at [repository URL to be added by the authors]. The case-study models are Autodesk Revit 2027 sample files distributed with the software.</w:t>
+        <w:t xml:space="preserve">[Author 2]:</w:t>
+      </w:r>
+      <w:r>
+        <w:t xml:space="preserve"> </w:t>
+      </w:r>
+      <w:r>
+        <w:t xml:space="preserve">[roles]. [One entry per author, using the CRediT roles: Conceptualization, Data curation, Formal analysis, Funding acquisition, Investigation, Methodology, Project administration, Resources, Software, Supervision, Validation, Visualization, Writing – original draft, Writing – review &amp; editing.]</w:t>
       </w:r>
     </w:p>
     <w:p>
@@ -12820,13 +12818,13 @@
           <w:b/>
           <w:bCs/>
         </w:rPr>
-        <w:t xml:space="preserve">Declaration of generative AI and AI-assisted technologies in the manuscript preparation process.</w:t>
-      </w:r>
-      <w:r>
-        <w:t xml:space="preserve"> </w:t>
-      </w:r>
-      <w:r>
-        <w:t xml:space="preserve">During the preparation of this work the author(s) used Claude (Anthropic) in order to [describe the use, e.g., assist with software implementation, data analysis and drafting of the manuscript]. After using this tool, the author(s) reviewed and edited the content as needed and take(s) full responsibility for the content of the published article. [Authors must complete and verify this statement in line with the journal’s policy.]</w:t>
+        <w:t xml:space="preserve">Funding.</w:t>
+      </w:r>
+      <w:r>
+        <w:t xml:space="preserve"> </w:t>
+      </w:r>
+      <w:r>
+        <w:t xml:space="preserve">This research did not receive any specific grant from funding agencies in the public, commercial, or not-for-profit sectors.</w:t>
       </w:r>
     </w:p>
     <w:p>
@@ -12838,13 +12836,49 @@
           <w:b/>
           <w:bCs/>
         </w:rPr>
-        <w:t xml:space="preserve">Acknowledgements.</w:t>
-      </w:r>
-      <w:r>
-        <w:t xml:space="preserve"> </w:t>
-      </w:r>
-      <w:r>
-        <w:t xml:space="preserve">[To be completed by the authors.]</w:t>
+        <w:t xml:space="preserve">Declaration of competing interest.</w:t>
+      </w:r>
+      <w:r>
+        <w:t xml:space="preserve"> </w:t>
+      </w:r>
+      <w:r>
+        <w:t xml:space="preserve">The authors declare that they have no known competing financial interests or personal relationships that could have appeared to influence the work reported in this paper.</w:t>
+      </w:r>
+    </w:p>
+    <w:p>
+      <w:pPr>
+        <w:pStyle w:val="BodyText"/>
+      </w:pPr>
+      <w:r>
+        <w:rPr>
+          <w:b/>
+          <w:bCs/>
+        </w:rPr>
+        <w:t xml:space="preserve">Data availability.</w:t>
+      </w:r>
+      <w:r>
+        <w:t xml:space="preserve"> </w:t>
+      </w:r>
+      <w:r>
+        <w:t xml:space="preserve">The source code (the pyRevit extension and the Python analysis package), the experiment scripts, the result tables and the expert rating instrument are openly available on GitHub at [GitHub URL]. The case-study models are Autodesk Revit 2027 sample files that are installed with the software and are not redistributed. The raw model exports can be regenerated from them with the released extraction scripts.</w:t>
+      </w:r>
+    </w:p>
+    <w:p>
+      <w:pPr>
+        <w:pStyle w:val="BodyText"/>
+      </w:pPr>
+      <w:r>
+        <w:rPr>
+          <w:b/>
+          <w:bCs/>
+        </w:rPr>
+        <w:t xml:space="preserve">Declaration of generative AI and AI-assisted technologies in the manuscript preparation process.</w:t>
+      </w:r>
+      <w:r>
+        <w:t xml:space="preserve"> </w:t>
+      </w:r>
+      <w:r>
+        <w:t xml:space="preserve">During the preparation of this work the authors used Claude Code with the Claude Opus 5.5 model (Anthropic) to search the literature, format the references and draft and revise the manuscript text, highlights and captions. The use of the same tool for software development and data analysis is described in Section 4.1. After using this tool, the authors reviewed and edited the content as needed and take full responsibility for the content of the published article.</w:t>
       </w:r>
     </w:p>
     <w:p>

</xml_diff>

<commit_message>
Add author block and CRediT statement to manuscript
Title page lists Maleeha Waseem (corresponding), Muhammad Arham and
Muhammed Ahmed with e-mail addresses; affiliation remains a placeholder.
CRediT roles drafted for author confirmation. build_docx.py now sets
only the author names in bold, with the affiliation in italics.

Co-Authored-By: Claude Opus 5.5 <noreply@anthropic.com>
</commit_message>
<xml_diff>
--- a/paper/manuscript.docx
+++ b/paper/manuscript.docx
@@ -15,7 +15,85 @@
         <w:pStyle w:val="Author"/>
       </w:pPr>
       <w:r>
-        <w:t xml:space="preserve">[Author name(s) and affiliation(s) — to be completed by the authors]</w:t>
+        <w:t xml:space="preserve">Maleeha Waseem</w:t>
+      </w:r>
+      <w:r>
+        <w:rPr>
+          <w:vertAlign w:val="superscript"/>
+        </w:rPr>
+        <w:t xml:space="preserve">a,*</w:t>
+      </w:r>
+      <w:r>
+        <w:t xml:space="preserve">, Muhammad Arham</w:t>
+      </w:r>
+      <w:r>
+        <w:rPr>
+          <w:vertAlign w:val="superscript"/>
+        </w:rPr>
+        <w:t xml:space="preserve">a</w:t>
+      </w:r>
+      <w:r>
+        <w:t xml:space="preserve">, Muhammed Ahmed</w:t>
+      </w:r>
+      <w:r>
+        <w:rPr>
+          <w:vertAlign w:val="superscript"/>
+        </w:rPr>
+        <w:t xml:space="preserve">a</w:t>
+      </w:r>
+    </w:p>
+    <w:p>
+      <w:pPr>
+        <w:pStyle w:val="Author"/>
+      </w:pPr>
+      <w:r>
+        <w:rPr>
+          <w:b w:val="0"/>
+          <w:i/>
+          <w:vertAlign w:val="superscript"/>
+        </w:rPr>
+        <w:t xml:space="preserve">a</w:t>
+      </w:r>
+      <w:r>
+        <w:rPr>
+          <w:b w:val="0"/>
+          <w:i/>
+        </w:rPr>
+        <w:t xml:space="preserve"> </w:t>
+      </w:r>
+      <w:r>
+        <w:rPr>
+          <w:b w:val="0"/>
+          <w:i/>
+        </w:rPr>
+        <w:t xml:space="preserve">[Department, University, City, Country]</w:t>
+      </w:r>
+    </w:p>
+    <w:p>
+      <w:pPr>
+        <w:pStyle w:val="Author"/>
+      </w:pPr>
+      <w:r>
+        <w:rPr>
+          <w:b w:val="0"/>
+          <w:i w:val="0"/>
+          <w:vertAlign w:val="superscript"/>
+        </w:rPr>
+        <w:t xml:space="preserve">*</w:t>
+      </w:r>
+      <w:r>
+        <w:rPr>
+          <w:b w:val="0"/>
+          <w:i w:val="0"/>
+        </w:rPr>
+        <w:t xml:space="preserve"> </w:t>
+      </w:r>
+      <w:r>
+        <w:rPr>
+          <w:b w:val="0"/>
+          <w:i w:val="0"/>
+        </w:rPr>
+        <w:t xml:space="preserve">Corresponding author. E-mail addresses: maleehawaseem30@gmail.com (M. Waseem), muhammadarham6333@gmail.com (M. Arham), muhammed.ahmed0999@gmail.com (M. Ahmed).</w:t>
       </w:r>
     </w:p>
     <w:p>
@@ -12784,13 +12862,13 @@
           <w:b/>
           <w:bCs/>
         </w:rPr>
-        <w:t xml:space="preserve">[Author 1]:</w:t>
-      </w:r>
-      <w:r>
-        <w:t xml:space="preserve"> </w:t>
-      </w:r>
-      <w:r>
-        <w:t xml:space="preserve">[roles].</w:t>
+        <w:t xml:space="preserve">Maleeha Waseem:</w:t>
+      </w:r>
+      <w:r>
+        <w:t xml:space="preserve"> </w:t>
+      </w:r>
+      <w:r>
+        <w:t xml:space="preserve">Conceptualization, Methodology, Visualization, Writing – original draft, Writing – review &amp; editing.</w:t>
       </w:r>
       <w:r>
         <w:t xml:space="preserve"> </w:t>
@@ -12800,13 +12878,29 @@
           <w:b/>
           <w:bCs/>
         </w:rPr>
-        <w:t xml:space="preserve">[Author 2]:</w:t>
-      </w:r>
-      <w:r>
-        <w:t xml:space="preserve"> </w:t>
-      </w:r>
-      <w:r>
-        <w:t xml:space="preserve">[roles]. [One entry per author, using the CRediT roles: Conceptualization, Data curation, Formal analysis, Funding acquisition, Investigation, Methodology, Project administration, Resources, Software, Supervision, Validation, Visualization, Writing – original draft, Writing – review &amp; editing.]</w:t>
+        <w:t xml:space="preserve">Muhammad Arham:</w:t>
+      </w:r>
+      <w:r>
+        <w:t xml:space="preserve"> </w:t>
+      </w:r>
+      <w:r>
+        <w:t xml:space="preserve">Data curation, Formal analysis, Validation, Writing – review &amp; editing.</w:t>
+      </w:r>
+      <w:r>
+        <w:t xml:space="preserve"> </w:t>
+      </w:r>
+      <w:r>
+        <w:rPr>
+          <w:b/>
+          <w:bCs/>
+        </w:rPr>
+        <w:t xml:space="preserve">Muhammed Ahmed:</w:t>
+      </w:r>
+      <w:r>
+        <w:t xml:space="preserve"> </w:t>
+      </w:r>
+      <w:r>
+        <w:t xml:space="preserve">Conceptualization, Software, Investigation, Resources, Project administration, Writing – review &amp; editing.</w:t>
       </w:r>
     </w:p>
     <w:p>

</xml_diff>

<commit_message>
Add GitHub repository link to data availability statement
Co-Authored-By: Claude Opus 5.5 <noreply@anthropic.com>
</commit_message>
<xml_diff>
--- a/paper/manuscript.docx
+++ b/paper/manuscript.docx
@@ -12954,7 +12954,21 @@
         <w:t xml:space="preserve"> </w:t>
       </w:r>
       <w:r>
-        <w:t xml:space="preserve">The source code (the pyRevit extension and the Python analysis package), the experiment scripts, the result tables and the expert rating instrument are openly available on GitHub at [GitHub URL]. The case-study models are Autodesk Revit 2027 sample files that are installed with the software and are not redistributed. The raw model exports can be regenerated from them with the released extraction scripts.</w:t>
+        <w:t xml:space="preserve">The source code (the pyRevit extension and the Python analysis package), the experiment scripts, the result tables and the expert rating instrument are openly available on GitHub at</w:t>
+      </w:r>
+      <w:r>
+        <w:t xml:space="preserve"> </w:t>
+      </w:r>
+      <w:hyperlink r:id="rId79">
+        <w:r>
+          <w:rPr>
+            <w:rStyle w:val="Hyperlink"/>
+          </w:rPr>
+          <w:t xml:space="preserve">https://github.com/Darkiii-2514/DT-Clash-Detection-Paper</w:t>
+        </w:r>
+      </w:hyperlink>
+      <w:r>
+        <w:t xml:space="preserve">. The case-study models are Autodesk Revit 2027 sample files that are installed with the software and are not redistributed. The raw model exports can be regenerated from them with the released extraction scripts.</w:t>
       </w:r>
     </w:p>
     <w:p>
@@ -12979,14 +12993,14 @@
       <w:pPr>
         <w:pStyle w:val="Heading1"/>
       </w:pPr>
-      <w:bookmarkStart w:id="79" w:name="_references"/>
+      <w:bookmarkStart w:id="80" w:name="_references"/>
       <w:r>
         <w:t xml:space="preserve">References</w:t>
       </w:r>
-      <w:bookmarkEnd w:id="79"/>
-    </w:p>
-    <w:bookmarkStart w:id="170" w:name="_refs"/>
-    <w:bookmarkStart w:id="81" w:name="_0d11f79aa28cd9deb2c05ea92254aebbdb6c879"/>
+      <w:bookmarkEnd w:id="80"/>
+    </w:p>
+    <w:bookmarkStart w:id="171" w:name="_refs"/>
+    <w:bookmarkStart w:id="82" w:name="_0d11f79aa28cd9deb2c05ea92254aebbdb6c879"/>
     <w:p>
       <w:pPr>
         <w:pStyle w:val="Bibliography"/>
@@ -13003,7 +13017,7 @@
       <w:r>
         <w:t xml:space="preserve">R. Chahrour, M.A. Hafeez, A.M. Ahmad, H.I. Sulieman, H. Dawood, S. Rodriguez-Trejo, M. Kassem, K.K. Naji, N. Dawood, Cost-benefit analysis of BIM-enabled design clash detection and resolution, Construction Management and Economics 39 (2020) 55–72. https://doi.org/</w:t>
       </w:r>
-      <w:hyperlink r:id="rId80">
+      <w:hyperlink r:id="rId81">
         <w:r>
           <w:rPr>
             <w:rStyle w:val="Hyperlink"/>
@@ -13015,8 +13029,8 @@
         <w:t xml:space="preserve">.</w:t>
       </w:r>
     </w:p>
-    <w:bookmarkEnd w:id="81"/>
-    <w:bookmarkStart w:id="83" w:name="_c12c19ede63a21dbfc9d3d5050f82292c584198"/>
+    <w:bookmarkEnd w:id="82"/>
+    <w:bookmarkStart w:id="84" w:name="_c12c19ede63a21dbfc9d3d5050f82292c584198"/>
     <w:p>
       <w:pPr>
         <w:pStyle w:val="Bibliography"/>
@@ -13033,7 +13047,7 @@
       <w:r>
         <w:t xml:space="preserve">A. Akponeware, Z. Adamu, Clash detection or clash avoidance? An investigation into coordination problems in 3D BIM, Buildings 7 (2017) 75. https://doi.org/</w:t>
       </w:r>
-      <w:hyperlink r:id="rId82">
+      <w:hyperlink r:id="rId83">
         <w:r>
           <w:rPr>
             <w:rStyle w:val="Hyperlink"/>
@@ -13045,8 +13059,8 @@
         <w:t xml:space="preserve">.</w:t>
       </w:r>
     </w:p>
-    <w:bookmarkEnd w:id="83"/>
-    <w:bookmarkStart w:id="85" w:name="_bcb3e6187df855698f5478690210076e621ae4f"/>
+    <w:bookmarkEnd w:id="84"/>
+    <w:bookmarkStart w:id="86" w:name="_bcb3e6187df855698f5478690210076e621ae4f"/>
     <w:p>
       <w:pPr>
         <w:pStyle w:val="Bibliography"/>
@@ -13063,7 +13077,7 @@
       <w:r>
         <w:t xml:space="preserve">Y. Hu, D. Castro-Lacouture, Clash relevance prediction based on machine learning, Journal of Computing in Civil Engineering 33 (2019). https://doi.org/</w:t>
       </w:r>
-      <w:hyperlink r:id="rId84">
+      <w:hyperlink r:id="rId85">
         <w:r>
           <w:rPr>
             <w:rStyle w:val="Hyperlink"/>
@@ -13075,8 +13089,8 @@
         <w:t xml:space="preserve">.</w:t>
       </w:r>
     </w:p>
-    <w:bookmarkEnd w:id="85"/>
-    <w:bookmarkStart w:id="87" w:name="_9657f735728280ff8f3f6836cdef366d962b57b"/>
+    <w:bookmarkEnd w:id="86"/>
+    <w:bookmarkStart w:id="88" w:name="_9657f735728280ff8f3f6836cdef366d962b57b"/>
     <w:p>
       <w:pPr>
         <w:pStyle w:val="Bibliography"/>
@@ -13093,7 +13107,7 @@
       <w:r>
         <w:t xml:space="preserve">W.Y. Lin, Y.-H. Huang, Filtering of irrelevant clashes detected by BIM software using a hybrid method of rule-based reasoning and supervised machine learning, Applied Sciences 9 (2019) 5324. https://doi.org/</w:t>
       </w:r>
-      <w:hyperlink r:id="rId86">
+      <w:hyperlink r:id="rId87">
         <w:r>
           <w:rPr>
             <w:rStyle w:val="Hyperlink"/>
@@ -13105,8 +13119,8 @@
         <w:t xml:space="preserve">.</w:t>
       </w:r>
     </w:p>
-    <w:bookmarkEnd w:id="87"/>
-    <w:bookmarkStart w:id="89" w:name="_74920588d189e587f41aa48e3e3d0d9ee5bafa1"/>
+    <w:bookmarkEnd w:id="88"/>
+    <w:bookmarkStart w:id="90" w:name="_74920588d189e587f41aa48e3e3d0d9ee5bafa1"/>
     <w:p>
       <w:pPr>
         <w:pStyle w:val="Bibliography"/>
@@ -13123,7 +13137,7 @@
       <w:r>
         <w:t xml:space="preserve">A.S. Borkowski, A. Kubrat, A conceptual AI-based framework for clash triage in building information modeling (BIM): Towards automated prioritization in complex construction projects, Buildings 16 (2026) 690. https://doi.org/</w:t>
       </w:r>
-      <w:hyperlink r:id="rId88">
+      <w:hyperlink r:id="rId89">
         <w:r>
           <w:rPr>
             <w:rStyle w:val="Hyperlink"/>
@@ -13135,8 +13149,8 @@
         <w:t xml:space="preserve">.</w:t>
       </w:r>
     </w:p>
-    <w:bookmarkEnd w:id="89"/>
-    <w:bookmarkStart w:id="91" w:name="_93968d1863045126ca7246346c9d38d50c77a45"/>
+    <w:bookmarkEnd w:id="90"/>
+    <w:bookmarkStart w:id="92" w:name="_93968d1863045126ca7246346c9d38d50c77a45"/>
     <w:p>
       <w:pPr>
         <w:pStyle w:val="Bibliography"/>
@@ -13153,7 +13167,7 @@
       <w:r>
         <w:t xml:space="preserve">H.J. Koo, B.C. Guerra, S. Saka, F. Leite, Streamlining BIM coordination and clash resolution through risk and relevance analysis, Journal of Construction Engineering and Management 152 (2026). https://doi.org/</w:t>
       </w:r>
-      <w:hyperlink r:id="rId90">
+      <w:hyperlink r:id="rId91">
         <w:r>
           <w:rPr>
             <w:rStyle w:val="Hyperlink"/>
@@ -13165,8 +13179,8 @@
         <w:t xml:space="preserve">.</w:t>
       </w:r>
     </w:p>
-    <w:bookmarkEnd w:id="91"/>
-    <w:bookmarkStart w:id="93" w:name="_7304767673e69689413816cb84859bd2be474a3"/>
+    <w:bookmarkEnd w:id="92"/>
+    <w:bookmarkStart w:id="94" w:name="_7304767673e69689413816cb84859bd2be474a3"/>
     <w:p>
       <w:pPr>
         <w:pStyle w:val="Bibliography"/>
@@ -13183,7 +13197,7 @@
       <w:r>
         <w:t xml:space="preserve">R. Ailem, C. Boton, Automating clash relevance filtering in BIM-based multidisciplinary coordination using machine learning, Automation in Construction 181 (2026) 106644. https://doi.org/</w:t>
       </w:r>
-      <w:hyperlink r:id="rId92">
+      <w:hyperlink r:id="rId93">
         <w:r>
           <w:rPr>
             <w:rStyle w:val="Hyperlink"/>
@@ -13195,8 +13209,8 @@
         <w:t xml:space="preserve">.</w:t>
       </w:r>
     </w:p>
-    <w:bookmarkEnd w:id="93"/>
-    <w:bookmarkStart w:id="95" w:name="_6f6548ae06c2811483e3ad89ba771a65205faca"/>
+    <w:bookmarkEnd w:id="94"/>
+    <w:bookmarkStart w:id="96" w:name="_6f6548ae06c2811483e3ad89ba771a65205faca"/>
     <w:p>
       <w:pPr>
         <w:pStyle w:val="Bibliography"/>
@@ -13213,7 +13227,7 @@
       <w:r>
         <w:t xml:space="preserve">I. Bitaraf, A. Salimpour, P. Elmi, A.A. Shirzadi Javid, Improved building information modeling based method for prioritizing clash detection in the building construction design phase, Buildings 14 (2024) 3611. https://doi.org/</w:t>
       </w:r>
-      <w:hyperlink r:id="rId94">
+      <w:hyperlink r:id="rId95">
         <w:r>
           <w:rPr>
             <w:rStyle w:val="Hyperlink"/>
@@ -13225,8 +13239,8 @@
         <w:t xml:space="preserve">.</w:t>
       </w:r>
     </w:p>
-    <w:bookmarkEnd w:id="95"/>
-    <w:bookmarkStart w:id="97" w:name="_b61b59c0e22eb05bf94c6fb7f6a7ff583356419"/>
+    <w:bookmarkEnd w:id="96"/>
+    <w:bookmarkStart w:id="98" w:name="_b61b59c0e22eb05bf94c6fb7f6a7ff583356419"/>
     <w:p>
       <w:pPr>
         <w:pStyle w:val="Bibliography"/>
@@ -13243,7 +13257,7 @@
       <w:r>
         <w:t xml:space="preserve">M. Grieves, J. Vickers, Digital twin: Mitigating unpredictable, undesirable emergent behavior in complex systems, in: Transdisciplinary Perspectives on Complex Systems, Springer International Publishing, 2016: pp. 85–113. https://doi.org/</w:t>
       </w:r>
-      <w:hyperlink r:id="rId96">
+      <w:hyperlink r:id="rId97">
         <w:r>
           <w:rPr>
             <w:rStyle w:val="Hyperlink"/>
@@ -13255,8 +13269,8 @@
         <w:t xml:space="preserve">.</w:t>
       </w:r>
     </w:p>
-    <w:bookmarkEnd w:id="97"/>
-    <w:bookmarkStart w:id="99" w:name="_a27a66ad21d549ee4ca693bf7f3758b6884c49a"/>
+    <w:bookmarkEnd w:id="98"/>
+    <w:bookmarkStart w:id="100" w:name="_a27a66ad21d549ee4ca693bf7f3758b6884c49a"/>
     <w:p>
       <w:pPr>
         <w:pStyle w:val="Bibliography"/>
@@ -13273,7 +13287,7 @@
       <w:r>
         <w:t xml:space="preserve">C. Boje, A. Guerriero, S. Kubicki, Y. Rezgui, Towards a semantic construction digital twin: Directions for future research, Automation in Construction 114 (2020) 103179. https://doi.org/</w:t>
       </w:r>
-      <w:hyperlink r:id="rId98">
+      <w:hyperlink r:id="rId99">
         <w:r>
           <w:rPr>
             <w:rStyle w:val="Hyperlink"/>
@@ -13285,8 +13299,8 @@
         <w:t xml:space="preserve">.</w:t>
       </w:r>
     </w:p>
-    <w:bookmarkEnd w:id="99"/>
-    <w:bookmarkStart w:id="101" w:name="_6c9cbe90a92aeeb1fb8ebdb61b9b42d82673916"/>
+    <w:bookmarkEnd w:id="100"/>
+    <w:bookmarkStart w:id="102" w:name="_6c9cbe90a92aeeb1fb8ebdb61b9b42d82673916"/>
     <w:p>
       <w:pPr>
         <w:pStyle w:val="Bibliography"/>
@@ -13303,7 +13317,7 @@
       <w:r>
         <w:t xml:space="preserve">R. Sacks, I. Brilakis, E. Pikas, H.S. Xie, M. Girolami, Construction with digital twin information systems, Data-Centric Engineering 1 (2020). https://doi.org/</w:t>
       </w:r>
-      <w:hyperlink r:id="rId100">
+      <w:hyperlink r:id="rId101">
         <w:r>
           <w:rPr>
             <w:rStyle w:val="Hyperlink"/>
@@ -13315,8 +13329,8 @@
         <w:t xml:space="preserve">.</w:t>
       </w:r>
     </w:p>
-    <w:bookmarkEnd w:id="101"/>
-    <w:bookmarkStart w:id="103" w:name="_db7277fee13d159fa035ff0aec09dc9d2e3fc17"/>
+    <w:bookmarkEnd w:id="102"/>
+    <w:bookmarkStart w:id="104" w:name="_db7277fee13d159fa035ff0aec09dc9d2e3fc17"/>
     <w:p>
       <w:pPr>
         <w:pStyle w:val="Bibliography"/>
@@ -13333,7 +13347,7 @@
       <w:r>
         <w:t xml:space="preserve">D.-G.J. Opoku, S. Perera, R. Osei-Kyei, M. Rashidi, Digital twin application in the construction industry: A literature review, Journal of Building Engineering 40 (2021) 102726. https://doi.org/</w:t>
       </w:r>
-      <w:hyperlink r:id="rId102">
+      <w:hyperlink r:id="rId103">
         <w:r>
           <w:rPr>
             <w:rStyle w:val="Hyperlink"/>
@@ -13345,8 +13359,8 @@
         <w:t xml:space="preserve">.</w:t>
       </w:r>
     </w:p>
-    <w:bookmarkEnd w:id="103"/>
-    <w:bookmarkStart w:id="104" w:name="_06e5951872820aa0f41fe13dcb89ffb864de2dd"/>
+    <w:bookmarkEnd w:id="104"/>
+    <w:bookmarkStart w:id="105" w:name="_06e5951872820aa0f41fe13dcb89ffb864de2dd"/>
     <w:p>
       <w:pPr>
         <w:pStyle w:val="Bibliography"/>
@@ -13373,8 +13387,8 @@
         <w:t xml:space="preserve">4-023-03, with change 3), Unified Facilities Criteria, Washington, DC, 2016.</w:t>
       </w:r>
     </w:p>
-    <w:bookmarkEnd w:id="104"/>
-    <w:bookmarkStart w:id="106" w:name="_725b849b7058aa2c6daa0a62e58df19f4b6ffb1"/>
+    <w:bookmarkEnd w:id="105"/>
+    <w:bookmarkStart w:id="107" w:name="_725b849b7058aa2c6daa0a62e58df19f4b6ffb1"/>
     <w:p>
       <w:pPr>
         <w:pStyle w:val="Bibliography"/>
@@ -13391,7 +13405,7 @@
       <w:r>
         <w:t xml:space="preserve">U. Starossek, M. Haberland, Disproportionate collapse: Terminology and procedures, Journal of Performance of Constructed Facilities 24 (2010) 519–528. https://doi.org/</w:t>
       </w:r>
-      <w:hyperlink r:id="rId105">
+      <w:hyperlink r:id="rId106">
         <w:r>
           <w:rPr>
             <w:rStyle w:val="Hyperlink"/>
@@ -13403,8 +13417,8 @@
         <w:t xml:space="preserve">.</w:t>
       </w:r>
     </w:p>
-    <w:bookmarkEnd w:id="106"/>
-    <w:bookmarkStart w:id="107" w:name="_a0a45fa49c0c13b82b94c6955ca0eec66f6d1df"/>
+    <w:bookmarkEnd w:id="107"/>
+    <w:bookmarkStart w:id="108" w:name="_a0a45fa49c0c13b82b94c6955ca0eec66f6d1df"/>
     <w:p>
       <w:pPr>
         <w:pStyle w:val="Bibliography"/>
@@ -13440,8 +13454,8 @@
         <w:t xml:space="preserve">318R-19), American Concrete Institute, Farmington Hills, MI, 2019.</w:t>
       </w:r>
     </w:p>
-    <w:bookmarkEnd w:id="107"/>
-    <w:bookmarkStart w:id="108" w:name="_3fd180c218df11ad837b279d4feeebf3c04c7a8"/>
+    <w:bookmarkEnd w:id="108"/>
+    <w:bookmarkStart w:id="109" w:name="_3fd180c218df11ad837b279d4feeebf3c04c7a8"/>
     <w:p>
       <w:pPr>
         <w:pStyle w:val="Bibliography"/>
@@ -13459,8 +13473,8 @@
         <w:t xml:space="preserve">D. Darwin, Steel and composite beams with web openings, American Institute of Steel Construction, Chicago, IL, 1990.</w:t>
       </w:r>
     </w:p>
-    <w:bookmarkEnd w:id="108"/>
-    <w:bookmarkStart w:id="110" w:name="_6f7453fd003f8b93d9addb079fe04ce66175b99"/>
+    <w:bookmarkEnd w:id="109"/>
+    <w:bookmarkStart w:id="111" w:name="_6f7453fd003f8b93d9addb079fe04ce66175b99"/>
     <w:p>
       <w:pPr>
         <w:pStyle w:val="Bibliography"/>
@@ -13477,7 +13491,7 @@
       <w:r>
         <w:t xml:space="preserve">G. van den Bergen, Efficient collision detection of complex deformable models using AABB trees, Journal of Graphics Tools 2 (1997) 1–13. https://doi.org/</w:t>
       </w:r>
-      <w:hyperlink r:id="rId109">
+      <w:hyperlink r:id="rId110">
         <w:r>
           <w:rPr>
             <w:rStyle w:val="Hyperlink"/>
@@ -13489,8 +13503,8 @@
         <w:t xml:space="preserve">.</w:t>
       </w:r>
     </w:p>
-    <w:bookmarkEnd w:id="110"/>
-    <w:bookmarkStart w:id="112" w:name="_91a4e0922361908098529de344b711dbc647e8d"/>
+    <w:bookmarkEnd w:id="111"/>
+    <w:bookmarkStart w:id="113" w:name="_91a4e0922361908098529de344b711dbc647e8d"/>
     <w:p>
       <w:pPr>
         <w:pStyle w:val="Bibliography"/>
@@ -13507,7 +13521,7 @@
       <w:r>
         <w:t xml:space="preserve">S. Gottschalk, M.C. Lin, D. Manocha, OBBTree: A hierarchical structure for rapid interference detection, in: Proceedings of the 23rd Annual Conference on Computer Graphics and Interactive Techniques, ACM, 1996: pp. 171–180. https://doi.org/</w:t>
       </w:r>
-      <w:hyperlink r:id="rId111">
+      <w:hyperlink r:id="rId112">
         <w:r>
           <w:rPr>
             <w:rStyle w:val="Hyperlink"/>
@@ -13519,8 +13533,8 @@
         <w:t xml:space="preserve">.</w:t>
       </w:r>
     </w:p>
-    <w:bookmarkEnd w:id="112"/>
-    <w:bookmarkStart w:id="114" w:name="_7dc52f09005060e74a2fefac7f40b3aaeceeb80"/>
+    <w:bookmarkEnd w:id="113"/>
+    <w:bookmarkStart w:id="115" w:name="_7dc52f09005060e74a2fefac7f40b3aaeceeb80"/>
     <w:p>
       <w:pPr>
         <w:pStyle w:val="Bibliography"/>
@@ -13537,7 +13551,7 @@
       <w:r>
         <w:t xml:space="preserve">A. Guttman, R-trees: A dynamic index structure for spatial searching, ACM SIGMOD Record 14 (1984) 47–57. https://doi.org/</w:t>
       </w:r>
-      <w:hyperlink r:id="rId113">
+      <w:hyperlink r:id="rId114">
         <w:r>
           <w:rPr>
             <w:rStyle w:val="Hyperlink"/>
@@ -13549,8 +13563,8 @@
         <w:t xml:space="preserve">.</w:t>
       </w:r>
     </w:p>
-    <w:bookmarkEnd w:id="114"/>
-    <w:bookmarkStart w:id="116" w:name="_fb3fd29184e1f6192b542d21235915d50f8fba1"/>
+    <w:bookmarkEnd w:id="115"/>
+    <w:bookmarkStart w:id="117" w:name="_fb3fd29184e1f6192b542d21235915d50f8fba1"/>
     <w:p>
       <w:pPr>
         <w:pStyle w:val="Bibliography"/>
@@ -13567,7 +13581,7 @@
       <w:r>
         <w:t xml:space="preserve">J. Pan, S. Chitta, D. Manocha, FCL: A general purpose library for collision and proximity queries, in: 2012 IEEE International Conference on Robotics and Automation, IEEE, 2012: pp. 3859–3866. https://doi.org/</w:t>
       </w:r>
-      <w:hyperlink r:id="rId115">
+      <w:hyperlink r:id="rId116">
         <w:r>
           <w:rPr>
             <w:rStyle w:val="Hyperlink"/>
@@ -13579,8 +13593,8 @@
         <w:t xml:space="preserve">.</w:t>
       </w:r>
     </w:p>
-    <w:bookmarkEnd w:id="116"/>
-    <w:bookmarkStart w:id="118" w:name="_7a16f1d8cb96f9d52ac115dc59ed134d29f1ea5"/>
+    <w:bookmarkEnd w:id="117"/>
+    <w:bookmarkStart w:id="119" w:name="_7a16f1d8cb96f9d52ac115dc59ed134d29f1ea5"/>
     <w:p>
       <w:pPr>
         <w:pStyle w:val="Bibliography"/>
@@ -13597,7 +13611,7 @@
       <w:r>
         <w:t xml:space="preserve">Y. Hu, D. Castro-Lacouture, C.M. Eastman, Holistic clash detection improvement using a component dependent network in BIM projects, Automation in Construction 105 (2019) 102832. https://doi.org/</w:t>
       </w:r>
-      <w:hyperlink r:id="rId117">
+      <w:hyperlink r:id="rId118">
         <w:r>
           <w:rPr>
             <w:rStyle w:val="Hyperlink"/>
@@ -13609,8 +13623,8 @@
         <w:t xml:space="preserve">.</w:t>
       </w:r>
     </w:p>
-    <w:bookmarkEnd w:id="118"/>
-    <w:bookmarkStart w:id="120" w:name="_0c08510da1b4a7fb68b237786ec859f43ee607e"/>
+    <w:bookmarkEnd w:id="119"/>
+    <w:bookmarkStart w:id="121" w:name="_0c08510da1b4a7fb68b237786ec859f43ee607e"/>
     <w:p>
       <w:pPr>
         <w:pStyle w:val="Bibliography"/>
@@ -13627,7 +13641,7 @@
       <w:r>
         <w:t xml:space="preserve">Y. Hu, D. Castro-Lacouture, C.M. Eastman, S.B. Navathe, Automatic clash correction sequence optimization using a clash dependency network, Automation in Construction 115 (2020) 103205. https://doi.org/</w:t>
       </w:r>
-      <w:hyperlink r:id="rId119">
+      <w:hyperlink r:id="rId120">
         <w:r>
           <w:rPr>
             <w:rStyle w:val="Hyperlink"/>
@@ -13639,8 +13653,8 @@
         <w:t xml:space="preserve">.</w:t>
       </w:r>
     </w:p>
-    <w:bookmarkEnd w:id="120"/>
-    <w:bookmarkStart w:id="122" w:name="_712af675f75afd3eacaa3adaa45096695e540f3"/>
+    <w:bookmarkEnd w:id="121"/>
+    <w:bookmarkStart w:id="123" w:name="_712af675f75afd3eacaa3adaa45096695e540f3"/>
     <w:p>
       <w:pPr>
         <w:pStyle w:val="Bibliography"/>
@@ -13657,7 +13671,7 @@
       <w:r>
         <w:t xml:space="preserve">Y. Hu, D. Castro-Lacouture, C.M. Eastman, S.B. Navathe, Component change list prediction for BIM-based clash resolution from a graph perspective, Journal of Construction Engineering and Management 147 (2021). https://doi.org/</w:t>
       </w:r>
-      <w:hyperlink r:id="rId121">
+      <w:hyperlink r:id="rId122">
         <w:r>
           <w:rPr>
             <w:rStyle w:val="Hyperlink"/>
@@ -13669,8 +13683,8 @@
         <w:t xml:space="preserve">.</w:t>
       </w:r>
     </w:p>
-    <w:bookmarkEnd w:id="122"/>
-    <w:bookmarkStart w:id="124" w:name="_f4829dfa5fbc30afc9e04eeeeb81fe869be8015"/>
+    <w:bookmarkEnd w:id="123"/>
+    <w:bookmarkStart w:id="125" w:name="_f4829dfa5fbc30afc9e04eeeeb81fe869be8015"/>
     <w:p>
       <w:pPr>
         <w:pStyle w:val="Bibliography"/>
@@ -13687,7 +13701,7 @@
       <w:r>
         <w:t xml:space="preserve">H.-C. Hsu, S. Chang, C.-C. Chen, I.-C. Wu, Knowledge-based system for resolving design clashes in building information models, Automation in Construction 110 (2020) 103001. https://doi.org/</w:t>
       </w:r>
-      <w:hyperlink r:id="rId123">
+      <w:hyperlink r:id="rId124">
         <w:r>
           <w:rPr>
             <w:rStyle w:val="Hyperlink"/>
@@ -13699,8 +13713,8 @@
         <w:t xml:space="preserve">.</w:t>
       </w:r>
     </w:p>
-    <w:bookmarkEnd w:id="124"/>
-    <w:bookmarkStart w:id="126" w:name="_38f5697bb4214dca847b577fb9266183e4d9d29"/>
+    <w:bookmarkEnd w:id="125"/>
+    <w:bookmarkStart w:id="127" w:name="_38f5697bb4214dca847b577fb9266183e4d9d29"/>
     <w:p>
       <w:pPr>
         <w:pStyle w:val="Bibliography"/>
@@ -13717,7 +13731,7 @@
       <w:r>
         <w:t xml:space="preserve">L. Wang, F. Leite, Formalized knowledge representation for spatial conflict coordination of mechanical, electrical and plumbing (MEP) systems in new building projects, Automation in Construction 64 (2016) 20–26. https://doi.org/</w:t>
       </w:r>
-      <w:hyperlink r:id="rId125">
+      <w:hyperlink r:id="rId126">
         <w:r>
           <w:rPr>
             <w:rStyle w:val="Hyperlink"/>
@@ -13729,8 +13743,8 @@
         <w:t xml:space="preserve">.</w:t>
       </w:r>
     </w:p>
-    <w:bookmarkEnd w:id="126"/>
-    <w:bookmarkStart w:id="128" w:name="_77a3a196c664c52754048042d3339f192c84a98"/>
+    <w:bookmarkEnd w:id="127"/>
+    <w:bookmarkStart w:id="129" w:name="_77a3a196c664c52754048042d3339f192c84a98"/>
     <w:p>
       <w:pPr>
         <w:pStyle w:val="Bibliography"/>
@@ -13747,7 +13761,7 @@
       <w:r>
         <w:t xml:space="preserve">J. Liu, P. Liu, L. Feng, W. Wu, D. Li, Y.F. Chen, Automated clash resolution for reinforcement steel design in concrete frames via q-learning and building information modeling, Automation in Construction 112 (2020) 103062. https://doi.org/</w:t>
       </w:r>
-      <w:hyperlink r:id="rId127">
+      <w:hyperlink r:id="rId128">
         <w:r>
           <w:rPr>
             <w:rStyle w:val="Hyperlink"/>
@@ -13759,8 +13773,8 @@
         <w:t xml:space="preserve">.</w:t>
       </w:r>
     </w:p>
-    <w:bookmarkEnd w:id="128"/>
-    <w:bookmarkStart w:id="130" w:name="_5b0a728e25e60610c03071a406bf0dbcf572b34"/>
+    <w:bookmarkEnd w:id="129"/>
+    <w:bookmarkStart w:id="131" w:name="_5b0a728e25e60610c03071a406bf0dbcf572b34"/>
     <w:p>
       <w:pPr>
         <w:pStyle w:val="Bibliography"/>
@@ -13777,7 +13791,7 @@
       <w:r>
         <w:t xml:space="preserve">W. Xu, P. Chen, H.-L. Chi, S. Wang, S. Zhou, Digital-physical integration for MEP-structural clash coordination using path planning and AR navigation, Automation in Construction 179 (2025) 106501. https://doi.org/</w:t>
       </w:r>
-      <w:hyperlink r:id="rId129">
+      <w:hyperlink r:id="rId130">
         <w:r>
           <w:rPr>
             <w:rStyle w:val="Hyperlink"/>
@@ -13789,8 +13803,8 @@
         <w:t xml:space="preserve">.</w:t>
       </w:r>
     </w:p>
-    <w:bookmarkEnd w:id="130"/>
-    <w:bookmarkStart w:id="132" w:name="_611a09f4bca5c45893d42075e9adc7f0eff85ce"/>
+    <w:bookmarkEnd w:id="131"/>
+    <w:bookmarkStart w:id="133" w:name="_611a09f4bca5c45893d42075e9adc7f0eff85ce"/>
     <w:p>
       <w:pPr>
         <w:pStyle w:val="Bibliography"/>
@@ -13807,7 +13821,7 @@
       <w:r>
         <w:t xml:space="preserve">C. Eastman, J. Lee, Y. Jeong, J. Lee, Automatic rule-based checking of building designs, Automation in Construction 18 (2009) 1011–1033. https://doi.org/</w:t>
       </w:r>
-      <w:hyperlink r:id="rId131">
+      <w:hyperlink r:id="rId132">
         <w:r>
           <w:rPr>
             <w:rStyle w:val="Hyperlink"/>
@@ -13819,8 +13833,8 @@
         <w:t xml:space="preserve">.</w:t>
       </w:r>
     </w:p>
-    <w:bookmarkEnd w:id="132"/>
-    <w:bookmarkStart w:id="134" w:name="_0a3848646ff61d9bc82751375ce6c01a7c58e7d"/>
+    <w:bookmarkEnd w:id="133"/>
+    <w:bookmarkStart w:id="135" w:name="_0a3848646ff61d9bc82751375ce6c01a7c58e7d"/>
     <w:p>
       <w:pPr>
         <w:pStyle w:val="Bibliography"/>
@@ -13837,7 +13851,7 @@
       <w:r>
         <w:t xml:space="preserve">W. Solihin, C. Eastman, Classification of rules for automated BIM rule checking development, Automation in Construction 53 (2015) 69–82. https://doi.org/</w:t>
       </w:r>
-      <w:hyperlink r:id="rId133">
+      <w:hyperlink r:id="rId134">
         <w:r>
           <w:rPr>
             <w:rStyle w:val="Hyperlink"/>
@@ -13849,8 +13863,8 @@
         <w:t xml:space="preserve">.</w:t>
       </w:r>
     </w:p>
-    <w:bookmarkEnd w:id="134"/>
-    <w:bookmarkStart w:id="136" w:name="_1407f02d5b15cdce71917e5f1556e4b205a7861"/>
+    <w:bookmarkEnd w:id="135"/>
+    <w:bookmarkStart w:id="137" w:name="_1407f02d5b15cdce71917e5f1556e4b205a7861"/>
     <w:p>
       <w:pPr>
         <w:pStyle w:val="Bibliography"/>
@@ -13867,7 +13881,7 @@
       <w:r>
         <w:t xml:space="preserve">S. Zhang, J. Teizer, J.-K. Lee, C.M. Eastman, M. Venugopal, Building information modeling (BIM) and safety: Automatic safety checking of construction models and schedules, Automation in Construction 29 (2013) 183–195. https://doi.org/</w:t>
       </w:r>
-      <w:hyperlink r:id="rId135">
+      <w:hyperlink r:id="rId136">
         <w:r>
           <w:rPr>
             <w:rStyle w:val="Hyperlink"/>
@@ -13879,8 +13893,8 @@
         <w:t xml:space="preserve">.</w:t>
       </w:r>
     </w:p>
-    <w:bookmarkEnd w:id="136"/>
-    <w:bookmarkStart w:id="138" w:name="_0572d69e049795dbe6c7c10f5606237c5840d33"/>
+    <w:bookmarkEnd w:id="137"/>
+    <w:bookmarkStart w:id="139" w:name="_0572d69e049795dbe6c7c10f5606237c5840d33"/>
     <w:p>
       <w:pPr>
         <w:pStyle w:val="Bibliography"/>
@@ -13897,7 +13911,7 @@
       <w:r>
         <w:t xml:space="preserve">X. Xie, J. Zhou, X. Fu, R. Zhang, H. Zhu, Q. Bao, Automated rule checking for MEP systems based on BIM and KBMS, Buildings 12 (2022) 934. https://doi.org/</w:t>
       </w:r>
-      <w:hyperlink r:id="rId137">
+      <w:hyperlink r:id="rId138">
         <w:r>
           <w:rPr>
             <w:rStyle w:val="Hyperlink"/>
@@ -13909,8 +13923,8 @@
         <w:t xml:space="preserve">.</w:t>
       </w:r>
     </w:p>
-    <w:bookmarkEnd w:id="138"/>
-    <w:bookmarkStart w:id="140" w:name="_e86ca6173ebb969c40287bb27edd2d4cf4ef0d4"/>
+    <w:bookmarkEnd w:id="139"/>
+    <w:bookmarkStart w:id="141" w:name="_e86ca6173ebb969c40287bb27edd2d4cf4ef0d4"/>
     <w:p>
       <w:pPr>
         <w:pStyle w:val="Bibliography"/>
@@ -13927,7 +13941,7 @@
       <w:r>
         <w:t xml:space="preserve">I.J. Ramaji, A.M. Memari, Interpretation of structural analytical models from the coordination view in building information models, Automation in Construction 90 (2018) 117–133. https://doi.org/</w:t>
       </w:r>
-      <w:hyperlink r:id="rId139">
+      <w:hyperlink r:id="rId140">
         <w:r>
           <w:rPr>
             <w:rStyle w:val="Hyperlink"/>
@@ -13939,8 +13953,8 @@
         <w:t xml:space="preserve">.</w:t>
       </w:r>
     </w:p>
-    <w:bookmarkEnd w:id="140"/>
-    <w:bookmarkStart w:id="142" w:name="_f1cc6bcf7ef0eacb4a2ed68fa54adba1162fdf5"/>
+    <w:bookmarkEnd w:id="141"/>
+    <w:bookmarkStart w:id="143" w:name="_f1cc6bcf7ef0eacb4a2ed68fa54adba1162fdf5"/>
     <w:p>
       <w:pPr>
         <w:pStyle w:val="Bibliography"/>
@@ -13957,7 +13971,7 @@
       <w:r>
         <w:t xml:space="preserve">R.M. Lawson, F. Hanus, D. Sonck, Large web openings in steel and composite beams, Steel Construction 10 (2017) 168–175. https://doi.org/</w:t>
       </w:r>
-      <w:hyperlink r:id="rId141">
+      <w:hyperlink r:id="rId142">
         <w:r>
           <w:rPr>
             <w:rStyle w:val="Hyperlink"/>
@@ -13969,8 +13983,8 @@
         <w:t xml:space="preserve">.</w:t>
       </w:r>
     </w:p>
-    <w:bookmarkEnd w:id="142"/>
-    <w:bookmarkStart w:id="144" w:name="_32f7d1420d0bdfaa9e57092a859aa66a5983a25"/>
+    <w:bookmarkEnd w:id="143"/>
+    <w:bookmarkStart w:id="145" w:name="_32f7d1420d0bdfaa9e57092a859aa66a5983a25"/>
     <w:p>
       <w:pPr>
         <w:pStyle w:val="Bibliography"/>
@@ -13987,7 +14001,7 @@
       <w:r>
         <w:t xml:space="preserve">A. Ahmed, M.M. Fayyadh, S. Naganathan, K. Nasharuddin, Reinforced concrete beams with web openings: A state of the art review, Materials &amp;Amp; Design 40 (2012) 90–102. https://doi.org/</w:t>
       </w:r>
-      <w:hyperlink r:id="rId143">
+      <w:hyperlink r:id="rId144">
         <w:r>
           <w:rPr>
             <w:rStyle w:val="Hyperlink"/>
@@ -13999,8 +14013,8 @@
         <w:t xml:space="preserve">.</w:t>
       </w:r>
     </w:p>
-    <w:bookmarkEnd w:id="144"/>
-    <w:bookmarkStart w:id="146" w:name="_5950e4ecb7a1b2c1a84e9478ea894afe811d9e3"/>
+    <w:bookmarkEnd w:id="145"/>
+    <w:bookmarkStart w:id="147" w:name="_5950e4ecb7a1b2c1a84e9478ea894afe811d9e3"/>
     <w:p>
       <w:pPr>
         <w:pStyle w:val="Bibliography"/>
@@ -14017,7 +14031,7 @@
       <w:r>
         <w:t xml:space="preserve">A.A. Elansary, A.A. Abdel Aty, H.A. Abdalla, M. Zawam, Shear behavior of reinforced concrete beams with web opening near supports, Structures 37 (2022) 1033–1041. https://doi.org/</w:t>
       </w:r>
-      <w:hyperlink r:id="rId145">
+      <w:hyperlink r:id="rId146">
         <w:r>
           <w:rPr>
             <w:rStyle w:val="Hyperlink"/>
@@ -14029,8 +14043,8 @@
         <w:t xml:space="preserve">.</w:t>
       </w:r>
     </w:p>
-    <w:bookmarkEnd w:id="146"/>
-    <w:bookmarkStart w:id="148" w:name="_b5f6d5b867fc628d291fcaaf5a49911d6636f5c"/>
+    <w:bookmarkEnd w:id="147"/>
+    <w:bookmarkStart w:id="149" w:name="_b5f6d5b867fc628d291fcaaf5a49911d6636f5c"/>
     <w:p>
       <w:pPr>
         <w:pStyle w:val="Bibliography"/>
@@ -14047,7 +14061,7 @@
       <w:r>
         <w:t xml:space="preserve">D. Mostofinejad, N. Jafarian, A. Naderi, A. Mostofinejad, M. Salehi, Effects of openings on the punching shear strength of reinforced concrete slabs, Structures 25 (2020) 760–773. https://doi.org/</w:t>
       </w:r>
-      <w:hyperlink r:id="rId147">
+      <w:hyperlink r:id="rId148">
         <w:r>
           <w:rPr>
             <w:rStyle w:val="Hyperlink"/>
@@ -14059,8 +14073,8 @@
         <w:t xml:space="preserve">.</w:t>
       </w:r>
     </w:p>
-    <w:bookmarkEnd w:id="148"/>
-    <w:bookmarkStart w:id="150" w:name="_9a2b4e75efdb3e2848fae6b0050102afc345cd1"/>
+    <w:bookmarkEnd w:id="149"/>
+    <w:bookmarkStart w:id="151" w:name="_9a2b4e75efdb3e2848fae6b0050102afc345cd1"/>
     <w:p>
       <w:pPr>
         <w:pStyle w:val="Bibliography"/>
@@ -14077,7 +14091,7 @@
       <w:r>
         <w:t xml:space="preserve">W. Kritzinger, M. Karner, G. Traar, J. Henjes, W. Sihn, Digital twin in manufacturing: A categorical literature review and classification, IFAC-PapersOnLine 51 (2018) 1016–1022. https://doi.org/</w:t>
       </w:r>
-      <w:hyperlink r:id="rId149">
+      <w:hyperlink r:id="rId150">
         <w:r>
           <w:rPr>
             <w:rStyle w:val="Hyperlink"/>
@@ -14089,8 +14103,8 @@
         <w:t xml:space="preserve">.</w:t>
       </w:r>
     </w:p>
-    <w:bookmarkEnd w:id="150"/>
-    <w:bookmarkStart w:id="152" w:name="_d5e75d5449c3f4e73c114dff1df12e8fd797ede"/>
+    <w:bookmarkEnd w:id="151"/>
+    <w:bookmarkStart w:id="153" w:name="_d5e75d5449c3f4e73c114dff1df12e8fd797ede"/>
     <w:p>
       <w:pPr>
         <w:pStyle w:val="Bibliography"/>
@@ -14107,7 +14121,7 @@
       <w:r>
         <w:t xml:space="preserve">C. Semeraro, M. Lezoche, H. Panetto, M. Dassisti, Digital twin paradigm: A systematic literature review, Computers in Industry 130 (2021) 103469. https://doi.org/</w:t>
       </w:r>
-      <w:hyperlink r:id="rId151">
+      <w:hyperlink r:id="rId152">
         <w:r>
           <w:rPr>
             <w:rStyle w:val="Hyperlink"/>
@@ -14119,8 +14133,8 @@
         <w:t xml:space="preserve">.</w:t>
       </w:r>
     </w:p>
-    <w:bookmarkEnd w:id="152"/>
-    <w:bookmarkStart w:id="154" w:name="_abbc38ac66a59802d6e912036d924b5954a3e45"/>
+    <w:bookmarkEnd w:id="153"/>
+    <w:bookmarkStart w:id="155" w:name="_abbc38ac66a59802d6e912036d924b5954a3e45"/>
     <w:p>
       <w:pPr>
         <w:pStyle w:val="Bibliography"/>
@@ -14137,7 +14151,7 @@
       <w:r>
         <w:t xml:space="preserve">M. Deng, C.C. Menassa, V.R. Kamat, From BIM to digital twins: A systematic review of the evolution of intelligent building representations in the AEC-FM industry, Journal of Information Technology in Construction 26 (2021) 58–83. https://doi.org/</w:t>
       </w:r>
-      <w:hyperlink r:id="rId153">
+      <w:hyperlink r:id="rId154">
         <w:r>
           <w:rPr>
             <w:rStyle w:val="Hyperlink"/>
@@ -14149,8 +14163,8 @@
         <w:t xml:space="preserve">.</w:t>
       </w:r>
     </w:p>
-    <w:bookmarkEnd w:id="154"/>
-    <w:bookmarkStart w:id="156" w:name="_6f370486d9356f395f412e6c0766b6eac0b8a51"/>
+    <w:bookmarkEnd w:id="155"/>
+    <w:bookmarkStart w:id="157" w:name="_6f370486d9356f395f412e6c0766b6eac0b8a51"/>
     <w:p>
       <w:pPr>
         <w:pStyle w:val="Bibliography"/>
@@ -14167,7 +14181,7 @@
       <w:r>
         <w:t xml:space="preserve">X. Hu, G. Olgun, R.H. Assaad, An intelligent BIM-enabled digital twin framework for real-time structural health monitoring using wireless IoT sensing, digital signal processing, and structural analysis, Expert Systems with Applications 252 (2024) 124204. https://doi.org/</w:t>
       </w:r>
-      <w:hyperlink r:id="rId155">
+      <w:hyperlink r:id="rId156">
         <w:r>
           <w:rPr>
             <w:rStyle w:val="Hyperlink"/>
@@ -14179,8 +14193,8 @@
         <w:t xml:space="preserve">.</w:t>
       </w:r>
     </w:p>
-    <w:bookmarkEnd w:id="156"/>
-    <w:bookmarkStart w:id="158" w:name="_d843663862e5b91e3850c54b9879712e9b7bbbc"/>
+    <w:bookmarkEnd w:id="157"/>
+    <w:bookmarkStart w:id="159" w:name="_d843663862e5b91e3850c54b9879712e9b7bbbc"/>
     <w:p>
       <w:pPr>
         <w:pStyle w:val="Bibliography"/>
@@ -14197,7 +14211,7 @@
       <w:r>
         <w:t xml:space="preserve">U. Starossek, M. Haberland, Approaches to measures of structural robustness, Structure and Infrastructure Engineering 7 (2011) 625–631. https://doi.org/</w:t>
       </w:r>
-      <w:hyperlink r:id="rId157">
+      <w:hyperlink r:id="rId158">
         <w:r>
           <w:rPr>
             <w:rStyle w:val="Hyperlink"/>
@@ -14209,8 +14223,8 @@
         <w:t xml:space="preserve">.</w:t>
       </w:r>
     </w:p>
-    <w:bookmarkEnd w:id="158"/>
-    <w:bookmarkStart w:id="160" w:name="_694f0822feed6f8bad320dddc38e11d3c76b411"/>
+    <w:bookmarkEnd w:id="159"/>
+    <w:bookmarkStart w:id="161" w:name="_694f0822feed6f8bad320dddc38e11d3c76b411"/>
     <w:p>
       <w:pPr>
         <w:pStyle w:val="Bibliography"/>
@@ -14227,7 +14241,7 @@
       <w:r>
         <w:t xml:space="preserve">A. McKay, K. Marchand, M. Diaz, Alternate path method in progressive collapse analysis: Variation of dynamic and nonlinear load increase factors, Practice Periodical on Structural Design and Construction 17 (2012) 152–160. https://doi.org/</w:t>
       </w:r>
-      <w:hyperlink r:id="rId159">
+      <w:hyperlink r:id="rId160">
         <w:r>
           <w:rPr>
             <w:rStyle w:val="Hyperlink"/>
@@ -14239,8 +14253,8 @@
         <w:t xml:space="preserve">.</w:t>
       </w:r>
     </w:p>
-    <w:bookmarkEnd w:id="160"/>
-    <w:bookmarkStart w:id="162" w:name="_aa98298a247e4168ddc76cfa50bb534a2deb625"/>
+    <w:bookmarkEnd w:id="161"/>
+    <w:bookmarkStart w:id="163" w:name="_aa98298a247e4168ddc76cfa50bb534a2deb625"/>
     <w:p>
       <w:pPr>
         <w:pStyle w:val="Bibliography"/>
@@ -14257,7 +14271,7 @@
       <w:r>
         <w:t xml:space="preserve">S. Zhao, N. Wu, Q. Wang, Deep residual u-net with input of static structural responses for efficient u* load transfer path analysis, Advanced Engineering Informatics 46 (2020) 101184. https://doi.org/</w:t>
       </w:r>
-      <w:hyperlink r:id="rId161">
+      <w:hyperlink r:id="rId162">
         <w:r>
           <w:rPr>
             <w:rStyle w:val="Hyperlink"/>
@@ -14269,8 +14283,8 @@
         <w:t xml:space="preserve">.</w:t>
       </w:r>
     </w:p>
-    <w:bookmarkEnd w:id="162"/>
-    <w:bookmarkStart w:id="164" w:name="_9bd1f2867fe2c3e412274958f7ebd87d2dfe882"/>
+    <w:bookmarkEnd w:id="163"/>
+    <w:bookmarkStart w:id="165" w:name="_9bd1f2867fe2c3e412274958f7ebd87d2dfe882"/>
     <w:p>
       <w:pPr>
         <w:pStyle w:val="Bibliography"/>
@@ -14287,7 +14301,7 @@
       <w:r>
         <w:t xml:space="preserve">T. Lengauer, R.E. Tarjan, A fast algorithm for finding dominators in a flowgraph, ACM Transactions on Programming Languages and Systems 1 (1979) 121–141. https://doi.org/</w:t>
       </w:r>
-      <w:hyperlink r:id="rId163">
+      <w:hyperlink r:id="rId164">
         <w:r>
           <w:rPr>
             <w:rStyle w:val="Hyperlink"/>
@@ -14299,8 +14313,8 @@
         <w:t xml:space="preserve">.</w:t>
       </w:r>
     </w:p>
-    <w:bookmarkEnd w:id="164"/>
-    <w:bookmarkStart w:id="166" w:name="_dc5878af5290816ea0fa94a2c9eba35c6f6822e"/>
+    <w:bookmarkEnd w:id="165"/>
+    <w:bookmarkStart w:id="167" w:name="_dc5878af5290816ea0fa94a2c9eba35c6f6822e"/>
     <w:p>
       <w:pPr>
         <w:pStyle w:val="Bibliography"/>
@@ -14326,7 +14340,7 @@
       <w:r>
         <w:t xml:space="preserve">7-22), American Society of Civil Engineers, Reston, VA, 2022. https://doi.org/</w:t>
       </w:r>
-      <w:hyperlink r:id="rId165">
+      <w:hyperlink r:id="rId166">
         <w:r>
           <w:rPr>
             <w:rStyle w:val="Hyperlink"/>
@@ -14338,8 +14352,8 @@
         <w:t xml:space="preserve">.</w:t>
       </w:r>
     </w:p>
-    <w:bookmarkEnd w:id="166"/>
-    <w:bookmarkStart w:id="167" w:name="_48204575c0e490be04040be2e399e2ed1a2a995"/>
+    <w:bookmarkEnd w:id="167"/>
+    <w:bookmarkStart w:id="168" w:name="_48204575c0e490be04040be2e399e2ed1a2a995"/>
     <w:p>
       <w:pPr>
         <w:pStyle w:val="Bibliography"/>
@@ -14366,8 +14380,8 @@
         <w:t xml:space="preserve">, in: Proceedings of the 7th Python in Science Conference (SciPy 2008), 2008: pp. 11–15.</w:t>
       </w:r>
     </w:p>
-    <w:bookmarkEnd w:id="167"/>
-    <w:bookmarkStart w:id="168" w:name="_f468efb278e18e644ce546146eee60da7ca9087"/>
+    <w:bookmarkEnd w:id="168"/>
+    <w:bookmarkStart w:id="169" w:name="_f468efb278e18e644ce546146eee60da7ca9087"/>
     <w:p>
       <w:pPr>
         <w:pStyle w:val="Bibliography"/>
@@ -14403,8 +14417,8 @@
         <w:t xml:space="preserve">) environment for autodesk revit, (2026).</w:t>
       </w:r>
     </w:p>
-    <w:bookmarkEnd w:id="168"/>
-    <w:bookmarkStart w:id="169" w:name="_11abfe69a8c7cb566f978a5aabb0fe1e9f62b53"/>
+    <w:bookmarkEnd w:id="169"/>
+    <w:bookmarkStart w:id="170" w:name="_11abfe69a8c7cb566f978a5aabb0fe1e9f62b53"/>
     <w:p>
       <w:pPr>
         <w:pStyle w:val="Bibliography"/>
@@ -14449,8 +14463,8 @@
         <w:t xml:space="preserve">), (2026).</w:t>
       </w:r>
     </w:p>
-    <w:bookmarkEnd w:id="169"/>
     <w:bookmarkEnd w:id="170"/>
+    <w:bookmarkEnd w:id="171"/>
     <w:sectPr>
       <w:footerReference w:type="default" r:id="rId9"/>
       <w:footnotePr>

</xml_diff>

<commit_message>
Spell out author names on title page and use "Muhammad Ahmed"
The corresponding-author e-mail line now gives full names instead of
initials, and the third author's name is spelled "Muhammad Ahmed" in
the manuscript, CRediT statement, README and LICENSE (as confirmed by
the authors; the e-mail address is unchanged).

Co-Authored-By: Claude Opus 5.5 <noreply@anthropic.com>
</commit_message>
<xml_diff>
--- a/paper/manuscript.docx
+++ b/paper/manuscript.docx
@@ -33,7 +33,7 @@
         <w:t xml:space="preserve">a</w:t>
       </w:r>
       <w:r>
-        <w:t xml:space="preserve">, Muhammed Ahmed</w:t>
+        <w:t xml:space="preserve">, Muhammad Ahmed</w:t>
       </w:r>
       <w:r>
         <w:rPr>
@@ -93,7 +93,7 @@
           <w:b w:val="0"/>
           <w:i w:val="0"/>
         </w:rPr>
-        <w:t xml:space="preserve">Corresponding author. E-mail addresses: maleehawaseem30@gmail.com (M. Waseem), muhammadarham6333@gmail.com (M. Arham), muhammed.ahmed0999@gmail.com (M. Ahmed).</w:t>
+        <w:t xml:space="preserve">Corresponding author. E-mail addresses: maleehawaseem30@gmail.com (Maleeha Waseem), muhammadarham6333@gmail.com (Muhammad Arham), muhammed.ahmed0999@gmail.com (Muhammad Ahmed).</w:t>
       </w:r>
     </w:p>
     <w:p>
@@ -12894,7 +12894,7 @@
           <w:b/>
           <w:bCs/>
         </w:rPr>
-        <w:t xml:space="preserve">Muhammed Ahmed:</w:t>
+        <w:t xml:space="preserve">Muhammad Ahmed:</w:t>
       </w:r>
       <w:r>
         <w:t xml:space="preserve"> </w:t>

</xml_diff>

<commit_message>
Add ASCE (J. Comput. Civ. Eng.) manuscript version; reorder authors
- build_docx.py --journal asce: author-date references (ASCE CSL),
  unnumbered headings with named cross-references, Data Availability
  Statement / Acknowledgments / Supplemental Materials (endmatter_asce.md)
  matching the submission-form selections, Video S1 linked from GitHub
  (ASCE no longer hosts supplemental files), article publishers omitted
- make_submission.py --journal asce: JCCE pack without highlights/video
- Authors now Muhammad Ahmed (corresponding), Maleeha Waseem, Muhammad
  Arham in the manuscript, CRediT order, README and LICENSE
- Fig. 3 caption no longer depends on colour (black-and-white print)
- refs.bib: fix HTML-escaped ampersand (Materials & Design)
- Cite Supplementary Video 1 in the digital-twin results

Co-Authored-By: Claude Opus 5.5 <noreply@anthropic.com>
</commit_message>
<xml_diff>
--- a/paper/manuscript.docx
+++ b/paper/manuscript.docx
@@ -15,7 +15,7 @@
         <w:pStyle w:val="Author"/>
       </w:pPr>
       <w:r>
-        <w:t xml:space="preserve">Maleeha Waseem</w:t>
+        <w:t xml:space="preserve">Muhammad Ahmed</w:t>
       </w:r>
       <w:r>
         <w:rPr>
@@ -24,16 +24,16 @@
         <w:t xml:space="preserve">a,*</w:t>
       </w:r>
       <w:r>
+        <w:t xml:space="preserve">, Maleeha Waseem</w:t>
+      </w:r>
+      <w:r>
+        <w:rPr>
+          <w:vertAlign w:val="superscript"/>
+        </w:rPr>
+        <w:t xml:space="preserve">a</w:t>
+      </w:r>
+      <w:r>
         <w:t xml:space="preserve">, Muhammad Arham</w:t>
-      </w:r>
-      <w:r>
-        <w:rPr>
-          <w:vertAlign w:val="superscript"/>
-        </w:rPr>
-        <w:t xml:space="preserve">a</w:t>
-      </w:r>
-      <w:r>
-        <w:t xml:space="preserve">, Muhammad Ahmed</w:t>
       </w:r>
       <w:r>
         <w:rPr>
@@ -93,7 +93,7 @@
           <w:b w:val="0"/>
           <w:i w:val="0"/>
         </w:rPr>
-        <w:t xml:space="preserve">Corresponding author. E-mail addresses: maleehawaseem30@gmail.com (Maleeha Waseem), muhammadarham6333@gmail.com (Muhammad Arham), muhammed.ahmed0999@gmail.com (Muhammad Ahmed).</w:t>
+        <w:t xml:space="preserve">Corresponding author. E-mail addresses: muhammed.ahmed0999@gmail.com (Muhammad Ahmed), maleehawaseem30@gmail.com (Maleeha Waseem), muhammadarham6333@gmail.com (Muhammad Arham).</w:t>
       </w:r>
     </w:p>
     <w:p>
@@ -9753,7 +9753,7 @@
           <wp:inline>
             <wp:extent cx="5753100" cy="2613713"/>
             <wp:effectExtent b="0" l="0" r="0" t="0"/>
-            <wp:docPr descr="Fig. 3. Load-path graph of Snowdon Towers. (a) Members coloured by the factored load they carry (log scale); light grey lines are support edges; orange rings mark the 18 members with no path to the ground. (b) Carried load by member type; bars show the median and interquartile range; loads below 1 kN are shown at 1 kN." title="" id="44" name="Picture"/>
+            <wp:docPr descr="Fig. 3. Load-path graph of Snowdon Towers. (a) Members shaded by the factored load they carry (log scale; darker means more load); thin lines are support edges; open circles mark the 18 members with no path to the ground. (b) Carried load by member type; bars show the median and interquartile range; loads below 1 kN are shown at 1 kN." title="" id="44" name="Picture"/>
             <a:graphic>
               <a:graphicData uri="http://schemas.openxmlformats.org/drawingml/2006/picture">
                 <pic:pic>
@@ -9796,7 +9796,7 @@
         <w:pStyle w:val="ImageCaption"/>
       </w:pPr>
       <w:r>
-        <w:t xml:space="preserve">Fig. 3. Load-path graph of Snowdon Towers. (a) Members coloured by the factored load they carry (log scale); light grey lines are support edges; orange rings mark the 18 members with no path to the ground. (b) Carried load by member type; bars show the median and interquartile range; loads below 1 kN are shown at 1 kN.</w:t>
+        <w:t xml:space="preserve">Fig. 3. Load-path graph of Snowdon Towers. (a) Members shaded by the factored load they carry (log scale; darker means more load); thin lines are support edges; open circles mark the 18 members with no path to the ground. (b) Carried load by member type; bars show the median and interquartile range; loads below 1 kN are shown at 1 kN.</w:t>
       </w:r>
     </w:p>
     <w:bookmarkEnd w:id="46"/>
@@ -11664,7 +11664,7 @@
         <w:t xml:space="preserve"> </w:t>
       </w:r>
       <w:r>
-        <w:t xml:space="preserve">to six decimals. The twin also behaved sensibly: deleting MEP elements resolved 11 clashes, adding duplicated runs created 21, and lowering beams by 150 mm created 16 new clashes and resolved 4. In Golden Nugget the corresponding medians were 37 ms and 2.5 s, again with identical results at every checkpoint (Section 5.6).</w:t>
+        <w:t xml:space="preserve">to six decimals. The twin also behaved sensibly: deleting MEP elements resolved 11 clashes, adding duplicated runs created 21, and lowering beams by 150 mm created 16 new clashes and resolved 4. Supplementary Video 1 shows the complete loop in Revit for one structural change. Lowering a W18x86 beam by 150 mm created three hard clashes on it (Critical, Major and Minor), and they appeared in the severity view 6.9 s after the edit: 3.1 s in Revit, which regenerates the beam and the joists attached to it and exports the change, and 3.4 s in the twin service. Restoring the beam returned the model to its 1,296 clashes. In Golden Nugget the corresponding medians were 37 ms and 2.5 s, again with identical results at every checkpoint (Section 5.6).</w:t>
       </w:r>
     </w:p>
     <w:bookmarkStart w:id="70" w:name="_00e8d5c8babd08c9d0cfb8321989021e974aea9"/>
@@ -12862,13 +12862,13 @@
           <w:b/>
           <w:bCs/>
         </w:rPr>
-        <w:t xml:space="preserve">Maleeha Waseem:</w:t>
-      </w:r>
-      <w:r>
-        <w:t xml:space="preserve"> </w:t>
-      </w:r>
-      <w:r>
-        <w:t xml:space="preserve">Conceptualization, Methodology, Visualization, Writing – original draft, Writing – review &amp; editing.</w:t>
+        <w:t xml:space="preserve">Muhammad Ahmed:</w:t>
+      </w:r>
+      <w:r>
+        <w:t xml:space="preserve"> </w:t>
+      </w:r>
+      <w:r>
+        <w:t xml:space="preserve">Conceptualization, Software, Investigation, Resources, Project administration, Writing – review &amp; editing.</w:t>
       </w:r>
       <w:r>
         <w:t xml:space="preserve"> </w:t>
@@ -12878,13 +12878,13 @@
           <w:b/>
           <w:bCs/>
         </w:rPr>
-        <w:t xml:space="preserve">Muhammad Arham:</w:t>
-      </w:r>
-      <w:r>
-        <w:t xml:space="preserve"> </w:t>
-      </w:r>
-      <w:r>
-        <w:t xml:space="preserve">Data curation, Formal analysis, Validation, Writing – review &amp; editing.</w:t>
+        <w:t xml:space="preserve">Maleeha Waseem:</w:t>
+      </w:r>
+      <w:r>
+        <w:t xml:space="preserve"> </w:t>
+      </w:r>
+      <w:r>
+        <w:t xml:space="preserve">Conceptualization, Methodology, Visualization, Writing – original draft, Writing – review &amp; editing.</w:t>
       </w:r>
       <w:r>
         <w:t xml:space="preserve"> </w:t>
@@ -12894,13 +12894,13 @@
           <w:b/>
           <w:bCs/>
         </w:rPr>
-        <w:t xml:space="preserve">Muhammad Ahmed:</w:t>
-      </w:r>
-      <w:r>
-        <w:t xml:space="preserve"> </w:t>
-      </w:r>
-      <w:r>
-        <w:t xml:space="preserve">Conceptualization, Software, Investigation, Resources, Project administration, Writing – review &amp; editing.</w:t>
+        <w:t xml:space="preserve">Muhammad Arham:</w:t>
+      </w:r>
+      <w:r>
+        <w:t xml:space="preserve"> </w:t>
+      </w:r>
+      <w:r>
+        <w:t xml:space="preserve">Data curation, Formal analysis, Validation, Writing – review &amp; editing.</w:t>
       </w:r>
     </w:p>
     <w:p>
@@ -13999,7 +13999,7 @@
         <w:t xml:space="preserve">	</w:t>
       </w:r>
       <w:r>
-        <w:t xml:space="preserve">A. Ahmed, M.M. Fayyadh, S. Naganathan, K. Nasharuddin, Reinforced concrete beams with web openings: A state of the art review, Materials &amp;Amp; Design 40 (2012) 90–102. https://doi.org/</w:t>
+        <w:t xml:space="preserve">A. Ahmed, M.M. Fayyadh, S. Naganathan, K. Nasharuddin, Reinforced concrete beams with web openings: A state of the art review, Materials &amp; Design 40 (2012) 90–102. https://doi.org/</w:t>
       </w:r>
       <w:hyperlink r:id="rId144">
         <w:r>

</xml_diff>